<commit_message>
Updated the structure to remove V2.0
</commit_message>
<xml_diff>
--- a/DRAFT_PULSAR_Berbec.docx
+++ b/DRAFT_PULSAR_Berbec.docx
@@ -15,16 +15,7 @@
           <w:color w:val="BC492A"/>
           <w:sz w:val="18"/>
         </w:rPr>
-        <w:t xml:space="preserve">CONCEPT / </w:t>
-      </w:r>
-      <w:r>
-        <w:rPr>
-          <w:rFonts w:eastAsia="Lato"/>
-          <w:b/>
-          <w:color w:val="BC492A"/>
-          <w:sz w:val="18"/>
-        </w:rPr>
-        <w:t>STRUCTURĂ VIDEO</w:t>
+        <w:t>CONCEPT / STRUCTURĂ VIDEO</w:t>
       </w:r>
     </w:p>
     <w:p>
@@ -54,7 +45,7 @@
           <w:color w:val="5E6C77"/>
           <w:sz w:val="24"/>
         </w:rPr>
-        <w:t>De la v1.5 la v1.6 și ce urmează cu v2.0</w:t>
+        <w:t>De la v1.5 la v1.6</w:t>
       </w:r>
     </w:p>
     <w:tbl>
@@ -112,7 +103,7 @@
                 <w:color w:val="1D2933"/>
                 <w:sz w:val="20"/>
               </w:rPr>
-              <w:t>Un video de aproximativ 7 minute despre roverul actual: cum funcționează, prin ce iterații a trecut și ce a învățat echipa din testare. În final, un preview al versiunii 2.0, care este încă în dezvoltare.</w:t>
+              <w:t>Un video de aproximativ 7 minute despre roverul actual: cum funcționează, prin ce iterații a trecut și ce a învățat echipa din testare.</w:t>
             </w:r>
           </w:p>
         </w:tc>
@@ -169,8 +160,8 @@
         <w:tblLook w:val="04a0" w:noHBand="0" w:noVBand="1" w:firstColumn="1" w:lastRow="0" w:lastColumn="0" w:firstRow="1"/>
       </w:tblPr>
       <w:tblGrid>
-        <w:gridCol w:w="1530"/>
-        <w:gridCol w:w="8220"/>
+        <w:gridCol w:w="1529"/>
+        <w:gridCol w:w="8221"/>
       </w:tblGrid>
       <w:tr>
         <w:trPr>
@@ -178,7 +169,7 @@
         </w:trPr>
         <w:tc>
           <w:tcPr>
-            <w:tcW w:w="1530" w:type="dxa"/>
+            <w:tcW w:w="1529" w:type="dxa"/>
             <w:tcBorders/>
           </w:tcPr>
           <w:p>
@@ -216,7 +207,7 @@
         </w:tc>
         <w:tc>
           <w:tcPr>
-            <w:tcW w:w="8220" w:type="dxa"/>
+            <w:tcW w:w="8221" w:type="dxa"/>
             <w:tcBorders/>
           </w:tcPr>
           <w:p>
@@ -305,8 +296,8 @@
         <w:tblLook w:val="04a0" w:noHBand="0" w:noVBand="1" w:firstColumn="1" w:lastRow="0" w:lastColumn="0" w:firstRow="1"/>
       </w:tblPr>
       <w:tblGrid>
-        <w:gridCol w:w="1530"/>
-        <w:gridCol w:w="8220"/>
+        <w:gridCol w:w="1529"/>
+        <w:gridCol w:w="8221"/>
       </w:tblGrid>
       <w:tr>
         <w:trPr>
@@ -314,7 +305,7 @@
         </w:trPr>
         <w:tc>
           <w:tcPr>
-            <w:tcW w:w="1530" w:type="dxa"/>
+            <w:tcW w:w="1529" w:type="dxa"/>
             <w:tcBorders/>
           </w:tcPr>
           <w:p>
@@ -352,7 +343,7 @@
         </w:tc>
         <w:tc>
           <w:tcPr>
-            <w:tcW w:w="8220" w:type="dxa"/>
+            <w:tcW w:w="8221" w:type="dxa"/>
             <w:tcBorders/>
           </w:tcPr>
           <w:p>
@@ -383,23 +374,7 @@
                 <w:color w:val="1D2933"/>
                 <w:sz w:val="18"/>
               </w:rPr>
-              <w:t>Cadru lângă rover. Îl introduc</w:t>
-            </w:r>
-            <w:r>
-              <w:rPr>
-                <w:rFonts w:eastAsia="Lato"/>
-                <w:color w:val="1D2933"/>
-                <w:sz w:val="18"/>
-              </w:rPr>
-              <w:t>em</w:t>
-            </w:r>
-            <w:r>
-              <w:rPr>
-                <w:rFonts w:eastAsia="Lato"/>
-                <w:color w:val="1D2933"/>
-                <w:sz w:val="18"/>
-              </w:rPr>
-              <w:t xml:space="preserve"> pe Berbec, apoi trec direct la filmări cu v1.5, prima versiune funcțională.</w:t>
+              <w:t>Cadru lângă rover. Îl introducem pe Berbec, apoi trec direct la filmări cu v1.5, prima versiune funcțională.</w:t>
             </w:r>
           </w:p>
           <w:p>
@@ -424,61 +399,7 @@
                 <w:color w:val="1D2933"/>
                 <w:sz w:val="18"/>
               </w:rPr>
-              <w:t xml:space="preserve">“This is Berbec, PULSAR’s current rover. What you’re looking at is version 1.6. But it didn’t start here. Our first working version was 1.5. </w:t>
-            </w:r>
-            <w:r>
-              <w:rPr>
-                <w:rFonts w:eastAsia="Lato"/>
-                <w:i/>
-                <w:color w:val="1D2933"/>
-                <w:sz w:val="18"/>
-              </w:rPr>
-              <w:t>While i</w:t>
-            </w:r>
-            <w:r>
-              <w:rPr>
-                <w:rFonts w:eastAsia="Lato"/>
-                <w:i/>
-                <w:color w:val="1D2933"/>
-                <w:sz w:val="18"/>
-              </w:rPr>
-              <w:t xml:space="preserve">t proved the concept, it was far from perfect </w:t>
-            </w:r>
-            <w:r>
-              <w:rPr>
-                <w:rFonts w:eastAsia="Lato"/>
-                <w:i/>
-                <w:color w:val="1D2933"/>
-                <w:sz w:val="18"/>
-              </w:rPr>
-              <w:t>and it could be improved</w:t>
-            </w:r>
-            <w:r>
-              <w:rPr>
-                <w:rFonts w:eastAsia="Lato"/>
-                <w:i/>
-                <w:color w:val="1D2933"/>
-                <w:sz w:val="18"/>
-              </w:rPr>
-              <w:t xml:space="preserve">. </w:t>
-            </w:r>
-            <w:r>
-              <w:rPr>
-                <w:rFonts w:eastAsia="Lato"/>
-                <w:i/>
-                <w:color w:val="1D2933"/>
-                <w:sz w:val="18"/>
-              </w:rPr>
-              <w:t>And, that’s exactly what we did.</w:t>
-            </w:r>
-            <w:r>
-              <w:rPr>
-                <w:rFonts w:eastAsia="Lato"/>
-                <w:i/>
-                <w:color w:val="1D2933"/>
-                <w:sz w:val="18"/>
-              </w:rPr>
-              <w:t>”</w:t>
+              <w:t>“This is Berbec, PULSAR’s current rover. What you’re looking at is version 1.6. But it didn’t start here. Our first working version was 1.5. While it proved the concept, it was far from perfect and it could be improved. And, that’s exactly what we did.”</w:t>
             </w:r>
           </w:p>
           <w:p>
@@ -536,8 +457,8 @@
         <w:tblLook w:val="04a0" w:noHBand="0" w:noVBand="1" w:firstColumn="1" w:lastRow="0" w:lastColumn="0" w:firstRow="1"/>
       </w:tblPr>
       <w:tblGrid>
-        <w:gridCol w:w="1530"/>
-        <w:gridCol w:w="8220"/>
+        <w:gridCol w:w="1529"/>
+        <w:gridCol w:w="8221"/>
       </w:tblGrid>
       <w:tr>
         <w:trPr>
@@ -545,7 +466,7 @@
         </w:trPr>
         <w:tc>
           <w:tcPr>
-            <w:tcW w:w="1530" w:type="dxa"/>
+            <w:tcW w:w="1529" w:type="dxa"/>
             <w:tcBorders/>
           </w:tcPr>
           <w:p>
@@ -583,7 +504,7 @@
         </w:tc>
         <w:tc>
           <w:tcPr>
-            <w:tcW w:w="8220" w:type="dxa"/>
+            <w:tcW w:w="8221" w:type="dxa"/>
             <w:tcBorders/>
           </w:tcPr>
           <w:p>
@@ -614,39 +535,7 @@
                 <w:color w:val="1D2933"/>
                 <w:sz w:val="18"/>
               </w:rPr>
-              <w:t>Capitolul principal despre iterații. Alegeți 3 - 4 modificări importante și arătați pentru fiecare: problema de pe v1.5, schimbarea făcută și ce rezultat a adus pe v1.6. P</w:t>
-            </w:r>
-            <w:r>
-              <w:rPr>
-                <w:rFonts w:eastAsia="Lato"/>
-                <w:color w:val="1D2933"/>
-                <w:sz w:val="18"/>
-              </w:rPr>
-              <w:t>unem</w:t>
-            </w:r>
-            <w:r>
-              <w:rPr>
-                <w:rFonts w:eastAsia="Lato"/>
-                <w:color w:val="1D2933"/>
-                <w:sz w:val="18"/>
-              </w:rPr>
-              <w:t xml:space="preserve"> imagini/</w:t>
-            </w:r>
-            <w:r>
-              <w:rPr>
-                <w:rFonts w:eastAsia="Lato"/>
-                <w:color w:val="1D2933"/>
-                <w:sz w:val="18"/>
-              </w:rPr>
-              <w:t>videouri</w:t>
-            </w:r>
-            <w:r>
-              <w:rPr>
-                <w:rFonts w:eastAsia="Lato"/>
-                <w:color w:val="1D2933"/>
-                <w:sz w:val="18"/>
-              </w:rPr>
-              <w:t xml:space="preserve"> de CAD, piese refăcute, asamblare, debugging și teste.</w:t>
+              <w:t>Capitolul principal despre iterații. Alegeți 3 - 4 modificări importante și arătați pentru fiecare: problema de pe v1.5, schimbarea făcută și ce rezultat a adus pe v1.6. Punem imagini/videouri de CAD, piese refăcute, asamblare, debugging și teste.</w:t>
             </w:r>
           </w:p>
           <w:p>
@@ -671,25 +560,7 @@
                 <w:color w:val="1D2933"/>
                 <w:sz w:val="18"/>
               </w:rPr>
-              <w:t xml:space="preserve">“Version 1.5 gave us a working platform </w:t>
-            </w:r>
-            <w:r>
-              <w:rPr>
-                <w:rFonts w:eastAsia="Lato"/>
-                <w:i/>
-                <w:color w:val="1D2933"/>
-                <w:sz w:val="18"/>
-              </w:rPr>
-              <w:t>to build off from</w:t>
-            </w:r>
-            <w:r>
-              <w:rPr>
-                <w:rFonts w:eastAsia="Lato"/>
-                <w:i/>
-                <w:color w:val="1D2933"/>
-                <w:sz w:val="18"/>
-              </w:rPr>
-              <w:t>. Version 1.6 came from figuring out what needed to change.”</w:t>
+              <w:t>“Version 1.5 gave us a working platform to build off from. Version 1.6 came from figuring out what needed to change.”</w:t>
             </w:r>
           </w:p>
           <w:p>
@@ -735,55 +606,7 @@
                 <w:color w:val="5E6C77"/>
                 <w:sz w:val="18"/>
               </w:rPr>
-              <w:t>Folosi</w:t>
-            </w:r>
-            <w:r>
-              <w:rPr>
-                <w:rFonts w:eastAsia="Lato"/>
-                <w:color w:val="5E6C77"/>
-                <w:sz w:val="18"/>
-              </w:rPr>
-              <w:t>m</w:t>
-            </w:r>
-            <w:r>
-              <w:rPr>
-                <w:rFonts w:eastAsia="Lato"/>
-                <w:color w:val="5E6C77"/>
-                <w:sz w:val="18"/>
-              </w:rPr>
-              <w:t xml:space="preserve"> comparații clare </w:t>
-            </w:r>
-            <w:r>
-              <w:rPr>
-                <w:rFonts w:eastAsia="Lato"/>
-                <w:color w:val="5E6C77"/>
-                <w:sz w:val="18"/>
-              </w:rPr>
-              <w:t xml:space="preserve">între </w:t>
-            </w:r>
-            <w:r>
-              <w:rPr>
-                <w:rFonts w:eastAsia="Lato"/>
-                <w:color w:val="5E6C77"/>
-                <w:sz w:val="18"/>
-              </w:rPr>
-              <w:t xml:space="preserve">v1.5 </w:t>
-            </w:r>
-            <w:r>
-              <w:rPr>
-                <w:rFonts w:eastAsia="Lato"/>
-                <w:color w:val="5E6C77"/>
-                <w:sz w:val="18"/>
-              </w:rPr>
-              <w:t>și</w:t>
-            </w:r>
-            <w:r>
-              <w:rPr>
-                <w:rFonts w:eastAsia="Lato"/>
-                <w:color w:val="5E6C77"/>
-                <w:sz w:val="18"/>
-              </w:rPr>
-              <w:t xml:space="preserve"> v1.6. </w:t>
+              <w:t>Folosim comparații clare între v1.5 și v1.6.</w:t>
             </w:r>
           </w:p>
         </w:tc>
@@ -861,7 +684,7 @@
         <w:tblLook w:val="04a0" w:noHBand="0" w:noVBand="1" w:firstColumn="1" w:lastRow="0" w:lastColumn="0" w:firstRow="1"/>
       </w:tblPr>
       <w:tblGrid>
-        <w:gridCol w:w="1530"/>
+        <w:gridCol w:w="1529"/>
         <w:gridCol w:w="8152"/>
       </w:tblGrid>
       <w:tr>
@@ -870,7 +693,7 @@
         </w:trPr>
         <w:tc>
           <w:tcPr>
-            <w:tcW w:w="1530" w:type="dxa"/>
+            <w:tcW w:w="1529" w:type="dxa"/>
             <w:tcBorders/>
           </w:tcPr>
           <w:p>
@@ -939,63 +762,7 @@
                 <w:color w:val="1D2933"/>
                 <w:sz w:val="18"/>
               </w:rPr>
-              <w:t xml:space="preserve">Intrăm în teste reale. Deplasare, manevre, obstacole și orice altceva </w:t>
-            </w:r>
-            <w:r>
-              <w:rPr>
-                <w:rFonts w:eastAsia="Lato"/>
-                <w:color w:val="1D2933"/>
-                <w:sz w:val="18"/>
-              </w:rPr>
-              <w:t>poate să pară impresionant</w:t>
-            </w:r>
-            <w:r>
-              <w:rPr>
-                <w:rFonts w:eastAsia="Lato"/>
-                <w:color w:val="1D2933"/>
-                <w:sz w:val="18"/>
-              </w:rPr>
-              <w:t xml:space="preserve">. Dacă </w:t>
-            </w:r>
-            <w:r>
-              <w:rPr>
-                <w:rFonts w:eastAsia="Lato"/>
-                <w:color w:val="1D2933"/>
-                <w:sz w:val="18"/>
-              </w:rPr>
-              <w:t xml:space="preserve">vor </w:t>
-            </w:r>
-            <w:r>
-              <w:rPr>
-                <w:rFonts w:eastAsia="Lato"/>
-                <w:color w:val="1D2933"/>
-                <w:sz w:val="18"/>
-              </w:rPr>
-              <w:t>exist</w:t>
-            </w:r>
-            <w:r>
-              <w:rPr>
-                <w:rFonts w:eastAsia="Lato"/>
-                <w:color w:val="1D2933"/>
-                <w:sz w:val="18"/>
-              </w:rPr>
-              <w:t>a</w:t>
-            </w:r>
-            <w:r>
-              <w:rPr>
-                <w:rFonts w:eastAsia="Lato"/>
-                <w:color w:val="1D2933"/>
-                <w:sz w:val="18"/>
-              </w:rPr>
-              <w:t xml:space="preserve"> filmări cu un test eșuat urmat de unul reușit, merită puse una lângă alta </w:t>
-            </w:r>
-            <w:r>
-              <w:rPr>
-                <w:rFonts w:eastAsia="Lato"/>
-                <w:color w:val="1D2933"/>
-                <w:sz w:val="18"/>
-              </w:rPr>
-              <w:t>pentru comparație.</w:t>
+              <w:t>Intrăm în teste reale. Deplasare, manevre, obstacole și orice altceva poate să pară impresionant. Dacă vor exista filmări cu un test eșuat urmat de unul reușit, merită puse una lângă alta pentru comparație.</w:t>
             </w:r>
           </w:p>
           <w:p>
@@ -1020,25 +787,7 @@
                 <w:color w:val="1D2933"/>
                 <w:sz w:val="18"/>
               </w:rPr>
-              <w:t>“</w:t>
-            </w:r>
-            <w:r>
-              <w:rPr>
-                <w:rFonts w:eastAsia="Lato"/>
-                <w:i/>
-                <w:color w:val="1D2933"/>
-                <w:sz w:val="18"/>
-              </w:rPr>
-              <w:t>However, theory can only get you so far, we had to test its actual capabilities.</w:t>
-            </w:r>
-            <w:r>
-              <w:rPr>
-                <w:rFonts w:eastAsia="Lato"/>
-                <w:i/>
-                <w:color w:val="1D2933"/>
-                <w:sz w:val="18"/>
-              </w:rPr>
-              <w:t>”</w:t>
+              <w:t>“However, theory can only get you so far, we had to test its actual capabilities.”</w:t>
             </w:r>
           </w:p>
           <w:p>
@@ -1062,23 +811,7 @@
                 <w:color w:val="5E6C77"/>
                 <w:sz w:val="18"/>
               </w:rPr>
-              <w:t>Lăs</w:t>
-            </w:r>
-            <w:r>
-              <w:rPr>
-                <w:rFonts w:eastAsia="Lato"/>
-                <w:color w:val="5E6C77"/>
-                <w:sz w:val="18"/>
-              </w:rPr>
-              <w:t>ăm</w:t>
-            </w:r>
-            <w:r>
-              <w:rPr>
-                <w:rFonts w:eastAsia="Lato"/>
-                <w:color w:val="5E6C77"/>
-                <w:sz w:val="18"/>
-              </w:rPr>
-              <w:t xml:space="preserve"> câteva secunde și cu sunetul real al roverului.</w:t>
+              <w:t>Lăsăm câteva secunde și cu sunetul real al roverului.</w:t>
             </w:r>
           </w:p>
         </w:tc>
@@ -1112,8 +845,8 @@
         <w:tblLook w:val="04a0" w:noHBand="0" w:noVBand="1" w:firstColumn="1" w:lastRow="0" w:lastColumn="0" w:firstRow="1"/>
       </w:tblPr>
       <w:tblGrid>
-        <w:gridCol w:w="1530"/>
-        <w:gridCol w:w="8220"/>
+        <w:gridCol w:w="1529"/>
+        <w:gridCol w:w="8221"/>
       </w:tblGrid>
       <w:tr>
         <w:trPr>
@@ -1121,7 +854,7 @@
         </w:trPr>
         <w:tc>
           <w:tcPr>
-            <w:tcW w:w="1530" w:type="dxa"/>
+            <w:tcW w:w="1529" w:type="dxa"/>
             <w:tcBorders/>
           </w:tcPr>
           <w:p>
@@ -1159,7 +892,7 @@
         </w:tc>
         <w:tc>
           <w:tcPr>
-            <w:tcW w:w="8220" w:type="dxa"/>
+            <w:tcW w:w="8221" w:type="dxa"/>
             <w:tcBorders/>
           </w:tcPr>
           <w:p>
@@ -1175,16 +908,7 @@
                 <w:color w:val="1D2933"/>
                 <w:sz w:val="26"/>
               </w:rPr>
-              <w:t>U</w:t>
-            </w:r>
-            <w:r>
-              <w:rPr>
-                <w:rFonts w:eastAsia="Lato"/>
-                <w:b/>
-                <w:color w:val="1D2933"/>
-                <w:sz w:val="26"/>
-              </w:rPr>
-              <w:t>nder the hood</w:t>
+              <w:t>Under the hood</w:t>
             </w:r>
           </w:p>
           <w:p>
@@ -1199,31 +923,7 @@
                 <w:color w:val="1D2933"/>
                 <w:sz w:val="18"/>
               </w:rPr>
-              <w:t>În laborator facem u</w:t>
-            </w:r>
-            <w:r>
-              <w:rPr>
-                <w:rFonts w:eastAsia="Lato"/>
-                <w:color w:val="1D2933"/>
-                <w:sz w:val="18"/>
-              </w:rPr>
-              <w:t>n tur scurt al sistemelor care îl fac să funcționeze: electronică, software, control, comunicații și alte subsisteme relevante. Explic</w:t>
-            </w:r>
-            <w:r>
-              <w:rPr>
-                <w:rFonts w:eastAsia="Lato"/>
-                <w:color w:val="1D2933"/>
-                <w:sz w:val="18"/>
-              </w:rPr>
-              <w:t>ăm</w:t>
-            </w:r>
-            <w:r>
-              <w:rPr>
-                <w:rFonts w:eastAsia="Lato"/>
-                <w:color w:val="1D2933"/>
-                <w:sz w:val="18"/>
-              </w:rPr>
-              <w:t xml:space="preserve"> doar ce există și este demonstrabil pe v1.6.</w:t>
+              <w:t>În laborator facem un tur scurt al sistemelor care îl fac să funcționeze: electronică, software, control, comunicații și alte subsisteme relevante. Explicăm doar ce există și este demonstrabil pe v1.6.</w:t>
             </w:r>
           </w:p>
           <w:p>
@@ -1248,25 +948,7 @@
                 <w:color w:val="1D2933"/>
                 <w:sz w:val="18"/>
               </w:rPr>
-              <w:t xml:space="preserve">“A lot of what makes Berbec work isn’t visible from the outside. </w:t>
-            </w:r>
-            <w:r>
-              <w:rPr>
-                <w:rFonts w:eastAsia="Lato"/>
-                <w:i/>
-                <w:color w:val="1D2933"/>
-                <w:sz w:val="18"/>
-              </w:rPr>
-              <w:t>So, h</w:t>
-            </w:r>
-            <w:r>
-              <w:rPr>
-                <w:rFonts w:eastAsia="Lato"/>
-                <w:i/>
-                <w:color w:val="1D2933"/>
-                <w:sz w:val="18"/>
-              </w:rPr>
-              <w:t>ere’s what’s running behind the scenes.”</w:t>
+              <w:t>“A lot of what makes Berbec work isn’t visible from the outside. So, here’s what’s running behind the scenes.”</w:t>
             </w:r>
           </w:p>
           <w:p>
@@ -1324,8 +1006,8 @@
         <w:tblLook w:val="04a0" w:noHBand="0" w:noVBand="1" w:firstColumn="1" w:lastRow="0" w:lastColumn="0" w:firstRow="1"/>
       </w:tblPr>
       <w:tblGrid>
-        <w:gridCol w:w="1530"/>
-        <w:gridCol w:w="8220"/>
+        <w:gridCol w:w="1529"/>
+        <w:gridCol w:w="8221"/>
       </w:tblGrid>
       <w:tr>
         <w:trPr>
@@ -1333,7 +1015,7 @@
         </w:trPr>
         <w:tc>
           <w:tcPr>
-            <w:tcW w:w="1530" w:type="dxa"/>
+            <w:tcW w:w="1529" w:type="dxa"/>
             <w:tcBorders/>
           </w:tcPr>
           <w:p>
@@ -1371,7 +1053,7 @@
         </w:tc>
         <w:tc>
           <w:tcPr>
-            <w:tcW w:w="8220" w:type="dxa"/>
+            <w:tcW w:w="8221" w:type="dxa"/>
             <w:tcBorders/>
           </w:tcPr>
           <w:p>
@@ -1387,7 +1069,7 @@
                 <w:color w:val="1D2933"/>
                 <w:sz w:val="26"/>
               </w:rPr>
-              <w:t xml:space="preserve">The next </w:t>
+              <w:t xml:space="preserve">The </w:t>
             </w:r>
             <w:r>
               <w:rPr>
@@ -1396,16 +1078,7 @@
                 <w:color w:val="1D2933"/>
                 <w:sz w:val="26"/>
               </w:rPr>
-              <w:t>milestone</w:t>
-            </w:r>
-            <w:r>
-              <w:rPr>
-                <w:rFonts w:eastAsia="Lato"/>
-                <w:b/>
-                <w:color w:val="1D2933"/>
-                <w:sz w:val="26"/>
-              </w:rPr>
-              <w:t xml:space="preserve"> v2.0</w:t>
+              <w:t>future</w:t>
             </w:r>
           </w:p>
           <w:p>
@@ -1420,7 +1093,7 @@
                 <w:color w:val="1D2933"/>
                 <w:sz w:val="18"/>
               </w:rPr>
-              <w:t>Rev</w:t>
+              <w:t xml:space="preserve">Revenim în cadru lângă Berbec pe Campus pentru efectul dramatic. </w:t>
             </w:r>
             <w:r>
               <w:rPr>
@@ -1428,31 +1101,7 @@
                 <w:color w:val="1D2933"/>
                 <w:sz w:val="18"/>
               </w:rPr>
-              <w:t>enim în</w:t>
-            </w:r>
-            <w:r>
-              <w:rPr>
-                <w:rFonts w:eastAsia="Lato"/>
-                <w:color w:val="1D2933"/>
-                <w:sz w:val="18"/>
-              </w:rPr>
-              <w:t xml:space="preserve"> cadru lângă Berbec </w:t>
-            </w:r>
-            <w:r>
-              <w:rPr>
-                <w:rFonts w:eastAsia="Lato"/>
-                <w:color w:val="1D2933"/>
-                <w:sz w:val="18"/>
-              </w:rPr>
-              <w:t>pe Campus pentru efectul dramatic</w:t>
-            </w:r>
-            <w:r>
-              <w:rPr>
-                <w:rFonts w:eastAsia="Lato"/>
-                <w:color w:val="1D2933"/>
-                <w:sz w:val="18"/>
-              </w:rPr>
-              <w:t>. Trecerea spre v2.0 trebuie să arate că v1.6 este o etapă, nu punctul final. Prezentăm direcția de design, schimbările majore planificate, CAD-urile și ce se află acum în dezvoltare.</w:t>
+              <w:t>Explicăm cum deși această versiune de rover este cea mai bună de până acum, nu ne vom oprim aici.</w:t>
             </w:r>
           </w:p>
           <w:p>
@@ -1491,18 +1140,10 @@
               <w:rPr>
                 <w:rFonts w:eastAsia="Lato"/>
                 <w:i/>
-                <w:sz w:val="18"/>
-              </w:rPr>
-              <w:t>Our next major step is version 2.0, which is already in development. This version is a complete overhaul of the original v1 design, built to push the rover's capabilities further than ever before.</w:t>
-            </w:r>
-            <w:r>
-              <w:rPr>
-                <w:rFonts w:eastAsia="Lato"/>
-                <w:i/>
                 <w:color w:val="1D2933"/>
                 <w:sz w:val="18"/>
               </w:rPr>
-              <w:t>”</w:t>
+              <w:t>We keep refining and improving the rover and our team continuousely.</w:t>
             </w:r>
           </w:p>
           <w:p>
@@ -1526,7 +1167,7 @@
                 <w:color w:val="5E6C77"/>
                 <w:sz w:val="18"/>
               </w:rPr>
-              <w:t xml:space="preserve">Schimbare de ritm în muzică. Ecran/CAD cu v2.0 și două-trei schimbări importante, explicate pe scurt </w:t>
+              <w:t xml:space="preserve">Schimbare de ritm în muzică. </w:t>
             </w:r>
             <w:r>
               <w:rPr>
@@ -1534,15 +1175,7 @@
                 <w:color w:val="5E6C77"/>
                 <w:sz w:val="18"/>
               </w:rPr>
-              <w:t>ca teaser</w:t>
-            </w:r>
-            <w:r>
-              <w:rPr>
-                <w:rFonts w:eastAsia="Lato"/>
-                <w:color w:val="5E6C77"/>
-                <w:sz w:val="18"/>
-              </w:rPr>
-              <w:t>.</w:t>
+              <w:t>Scenă cu apus de soare.</w:t>
             </w:r>
           </w:p>
         </w:tc>
@@ -1576,8 +1209,8 @@
         <w:tblLook w:val="04a0" w:noHBand="0" w:noVBand="1" w:firstColumn="1" w:lastRow="0" w:lastColumn="0" w:firstRow="1"/>
       </w:tblPr>
       <w:tblGrid>
-        <w:gridCol w:w="1530"/>
-        <w:gridCol w:w="8220"/>
+        <w:gridCol w:w="1529"/>
+        <w:gridCol w:w="8221"/>
       </w:tblGrid>
       <w:tr>
         <w:trPr>
@@ -1585,7 +1218,7 @@
         </w:trPr>
         <w:tc>
           <w:tcPr>
-            <w:tcW w:w="1530" w:type="dxa"/>
+            <w:tcW w:w="1529" w:type="dxa"/>
             <w:tcBorders/>
           </w:tcPr>
           <w:p>
@@ -1623,7 +1256,7 @@
         </w:tc>
         <w:tc>
           <w:tcPr>
-            <w:tcW w:w="8220" w:type="dxa"/>
+            <w:tcW w:w="8221" w:type="dxa"/>
             <w:tcBorders/>
           </w:tcPr>
           <w:p>
@@ -1720,15 +1353,7 @@
                 <w:color w:val="5E6C77"/>
                 <w:sz w:val="18"/>
               </w:rPr>
-              <w:t>Fa</w:t>
-            </w:r>
-            <w:r>
-              <w:rPr>
-                <w:rFonts w:eastAsia="Lato"/>
-                <w:color w:val="5E6C77"/>
-                <w:sz w:val="18"/>
-              </w:rPr>
-              <w:t>de out. Logo PULSAR simplu,</w:t>
+              <w:t>Fade out. Logo PULSAR simplu,</w:t>
             </w:r>
           </w:p>
         </w:tc>
@@ -2061,15 +1686,7 @@
           <w:color w:val="1D2933"/>
           <w:sz w:val="19"/>
         </w:rPr>
-        <w:t xml:space="preserve">1 – 2 </w:t>
-      </w:r>
-      <w:r>
-        <w:rPr>
-          <w:rFonts w:eastAsia="Lato"/>
-          <w:color w:val="1D2933"/>
-          <w:sz w:val="19"/>
-        </w:rPr>
-        <w:t>schimbări tehnice majore care merită explicate.</w:t>
+        <w:t>1 – 2 schimbări tehnice majore care merită explicate.</w:t>
       </w:r>
     </w:p>
     <w:p>
@@ -2104,15 +1721,7 @@
           <w:color w:val="1D2933"/>
           <w:sz w:val="19"/>
         </w:rPr>
-        <w:t>Intro și final cinematice; mijlocul mai direct, cu explicații scurte și imagini/</w:t>
-      </w:r>
-      <w:r>
-        <w:rPr>
-          <w:rFonts w:eastAsia="Lato"/>
-          <w:color w:val="1D2933"/>
-          <w:sz w:val="19"/>
-        </w:rPr>
-        <w:t>videoclipuri relevante.</w:t>
+        <w:t>Intro și final cinematice; mijlocul mai direct, cu explicații scurte și imagini/videoclipuri relevante.</w:t>
       </w:r>
     </w:p>
     <w:p>
@@ -2125,13 +1734,7 @@
         <w:rPr>
           <w:b/>
         </w:rPr>
-        <w:t>Voice-Over</w:t>
-      </w:r>
-      <w:r>
-        <w:rPr>
-          <w:b/>
-        </w:rPr>
-        <w:t xml:space="preserve"> </w:t>
+        <w:t xml:space="preserve">Voice-Over </w:t>
       </w:r>
       <w:r>
         <w:rPr>
@@ -2253,7 +1856,7 @@
     </w:r>
     <w:r>
       <w:rPr/>
-      <w:t>1</w:t>
+      <w:t>3</w:t>
     </w:r>
     <w:r>
       <w:rPr/>
@@ -2293,7 +1896,7 @@
     </w:r>
     <w:r>
       <w:rPr/>
-      <w:t>1</w:t>
+      <w:t>3</w:t>
     </w:r>
     <w:r>
       <w:rPr/>
@@ -2336,16 +1939,7 @@
         <w:color w:val="5E6C77"/>
         <w:sz w:val="16"/>
       </w:rPr>
-      <w:t xml:space="preserve">PULSAR  /  </w:t>
-    </w:r>
-    <w:r>
-      <w:rPr>
-        <w:rFonts w:eastAsia="Lato"/>
-        <w:b/>
-        <w:color w:val="5E6C77"/>
-        <w:sz w:val="16"/>
-      </w:rPr>
-      <w:t>MEDIA</w:t>
+      <w:t>PULSAR  /  MEDIA</w:t>
     </w:r>
   </w:p>
 </w:hdr>
@@ -2370,16 +1964,7 @@
         <w:color w:val="5E6C77"/>
         <w:sz w:val="16"/>
       </w:rPr>
-      <w:t xml:space="preserve">PULSAR  /  </w:t>
-    </w:r>
-    <w:r>
-      <w:rPr>
-        <w:rFonts w:eastAsia="Lato"/>
-        <w:b/>
-        <w:color w:val="5E6C77"/>
-        <w:sz w:val="16"/>
-      </w:rPr>
-      <w:t>MEDIA</w:t>
+      <w:t>PULSAR  /  MEDIA</w:t>
     </w:r>
   </w:p>
 </w:hdr>
@@ -2414,6 +1999,7 @@
         </w:tabs>
         <w:ind w:start="1080" w:hanging="360"/>
       </w:pPr>
+      <w:rPr/>
     </w:lvl>
     <w:lvl w:ilvl="2">
       <w:start w:val="1"/>
@@ -2426,6 +2012,7 @@
         </w:tabs>
         <w:ind w:start="1440" w:hanging="360"/>
       </w:pPr>
+      <w:rPr/>
     </w:lvl>
     <w:lvl w:ilvl="3">
       <w:start w:val="1"/>
@@ -2438,6 +2025,7 @@
         </w:tabs>
         <w:ind w:start="1800" w:hanging="360"/>
       </w:pPr>
+      <w:rPr/>
     </w:lvl>
     <w:lvl w:ilvl="4">
       <w:start w:val="1"/>
@@ -2450,6 +2038,7 @@
         </w:tabs>
         <w:ind w:start="2160" w:hanging="360"/>
       </w:pPr>
+      <w:rPr/>
     </w:lvl>
     <w:lvl w:ilvl="5">
       <w:start w:val="1"/>
@@ -2462,6 +2051,7 @@
         </w:tabs>
         <w:ind w:start="2520" w:hanging="360"/>
       </w:pPr>
+      <w:rPr/>
     </w:lvl>
     <w:lvl w:ilvl="6">
       <w:start w:val="1"/>
@@ -2474,6 +2064,7 @@
         </w:tabs>
         <w:ind w:start="2880" w:hanging="360"/>
       </w:pPr>
+      <w:rPr/>
     </w:lvl>
     <w:lvl w:ilvl="7">
       <w:start w:val="1"/>
@@ -2486,6 +2077,7 @@
         </w:tabs>
         <w:ind w:start="3240" w:hanging="360"/>
       </w:pPr>
+      <w:rPr/>
     </w:lvl>
     <w:lvl w:ilvl="8">
       <w:start w:val="1"/>
@@ -2498,6 +2090,7 @@
         </w:tabs>
         <w:ind w:start="3600" w:hanging="360"/>
       </w:pPr>
+      <w:rPr/>
     </w:lvl>
   </w:abstractNum>
   <w:abstractNum w:abstractNumId="2">
@@ -2527,6 +2120,7 @@
         </w:tabs>
         <w:ind w:start="1080" w:hanging="360"/>
       </w:pPr>
+      <w:rPr/>
     </w:lvl>
     <w:lvl w:ilvl="2">
       <w:start w:val="1"/>
@@ -2539,6 +2133,7 @@
         </w:tabs>
         <w:ind w:start="1440" w:hanging="360"/>
       </w:pPr>
+      <w:rPr/>
     </w:lvl>
     <w:lvl w:ilvl="3">
       <w:start w:val="1"/>
@@ -2551,6 +2146,7 @@
         </w:tabs>
         <w:ind w:start="1800" w:hanging="360"/>
       </w:pPr>
+      <w:rPr/>
     </w:lvl>
     <w:lvl w:ilvl="4">
       <w:start w:val="1"/>
@@ -2563,6 +2159,7 @@
         </w:tabs>
         <w:ind w:start="2160" w:hanging="360"/>
       </w:pPr>
+      <w:rPr/>
     </w:lvl>
     <w:lvl w:ilvl="5">
       <w:start w:val="1"/>
@@ -2575,6 +2172,7 @@
         </w:tabs>
         <w:ind w:start="2520" w:hanging="360"/>
       </w:pPr>
+      <w:rPr/>
     </w:lvl>
     <w:lvl w:ilvl="6">
       <w:start w:val="1"/>
@@ -2587,6 +2185,7 @@
         </w:tabs>
         <w:ind w:start="2880" w:hanging="360"/>
       </w:pPr>
+      <w:rPr/>
     </w:lvl>
     <w:lvl w:ilvl="7">
       <w:start w:val="1"/>
@@ -2599,6 +2198,7 @@
         </w:tabs>
         <w:ind w:start="3240" w:hanging="360"/>
       </w:pPr>
+      <w:rPr/>
     </w:lvl>
     <w:lvl w:ilvl="8">
       <w:start w:val="1"/>
@@ -2611,6 +2211,7 @@
         </w:tabs>
         <w:ind w:start="3600" w:hanging="360"/>
       </w:pPr>
+      <w:rPr/>
     </w:lvl>
   </w:abstractNum>
   <w:abstractNum w:abstractNumId="3">
@@ -2640,6 +2241,7 @@
         </w:tabs>
         <w:ind w:start="1080" w:hanging="360"/>
       </w:pPr>
+      <w:rPr/>
     </w:lvl>
     <w:lvl w:ilvl="2">
       <w:start w:val="1"/>
@@ -2652,6 +2254,7 @@
         </w:tabs>
         <w:ind w:start="1440" w:hanging="360"/>
       </w:pPr>
+      <w:rPr/>
     </w:lvl>
     <w:lvl w:ilvl="3">
       <w:start w:val="1"/>
@@ -2664,6 +2267,7 @@
         </w:tabs>
         <w:ind w:start="1800" w:hanging="360"/>
       </w:pPr>
+      <w:rPr/>
     </w:lvl>
     <w:lvl w:ilvl="4">
       <w:start w:val="1"/>
@@ -2676,6 +2280,7 @@
         </w:tabs>
         <w:ind w:start="2160" w:hanging="360"/>
       </w:pPr>
+      <w:rPr/>
     </w:lvl>
     <w:lvl w:ilvl="5">
       <w:start w:val="1"/>
@@ -2688,6 +2293,7 @@
         </w:tabs>
         <w:ind w:start="2520" w:hanging="360"/>
       </w:pPr>
+      <w:rPr/>
     </w:lvl>
     <w:lvl w:ilvl="6">
       <w:start w:val="1"/>
@@ -2700,6 +2306,7 @@
         </w:tabs>
         <w:ind w:start="2880" w:hanging="360"/>
       </w:pPr>
+      <w:rPr/>
     </w:lvl>
     <w:lvl w:ilvl="7">
       <w:start w:val="1"/>
@@ -2712,6 +2319,7 @@
         </w:tabs>
         <w:ind w:start="3240" w:hanging="360"/>
       </w:pPr>
+      <w:rPr/>
     </w:lvl>
     <w:lvl w:ilvl="8">
       <w:start w:val="1"/>
@@ -2724,6 +2332,7 @@
         </w:tabs>
         <w:ind w:start="3600" w:hanging="360"/>
       </w:pPr>
+      <w:rPr/>
     </w:lvl>
   </w:abstractNum>
   <w:abstractNum w:abstractNumId="4">
@@ -2751,6 +2360,7 @@
         </w:tabs>
         <w:ind w:start="1080" w:hanging="360"/>
       </w:pPr>
+      <w:rPr/>
     </w:lvl>
     <w:lvl w:ilvl="2">
       <w:start w:val="1"/>
@@ -2763,6 +2373,7 @@
         </w:tabs>
         <w:ind w:start="1440" w:hanging="360"/>
       </w:pPr>
+      <w:rPr/>
     </w:lvl>
     <w:lvl w:ilvl="3">
       <w:start w:val="1"/>
@@ -2775,6 +2386,7 @@
         </w:tabs>
         <w:ind w:start="1800" w:hanging="360"/>
       </w:pPr>
+      <w:rPr/>
     </w:lvl>
     <w:lvl w:ilvl="4">
       <w:start w:val="1"/>
@@ -2787,6 +2399,7 @@
         </w:tabs>
         <w:ind w:start="2160" w:hanging="360"/>
       </w:pPr>
+      <w:rPr/>
     </w:lvl>
     <w:lvl w:ilvl="5">
       <w:start w:val="1"/>
@@ -2799,6 +2412,7 @@
         </w:tabs>
         <w:ind w:start="2520" w:hanging="360"/>
       </w:pPr>
+      <w:rPr/>
     </w:lvl>
     <w:lvl w:ilvl="6">
       <w:start w:val="1"/>
@@ -2811,6 +2425,7 @@
         </w:tabs>
         <w:ind w:start="2880" w:hanging="360"/>
       </w:pPr>
+      <w:rPr/>
     </w:lvl>
     <w:lvl w:ilvl="7">
       <w:start w:val="1"/>
@@ -2823,6 +2438,7 @@
         </w:tabs>
         <w:ind w:start="3240" w:hanging="360"/>
       </w:pPr>
+      <w:rPr/>
     </w:lvl>
     <w:lvl w:ilvl="8">
       <w:start w:val="1"/>
@@ -2835,6 +2451,7 @@
         </w:tabs>
         <w:ind w:start="3600" w:hanging="360"/>
       </w:pPr>
+      <w:rPr/>
     </w:lvl>
   </w:abstractNum>
   <w:abstractNum w:abstractNumId="5">
@@ -2862,6 +2479,7 @@
         </w:tabs>
         <w:ind w:start="1080" w:hanging="360"/>
       </w:pPr>
+      <w:rPr/>
     </w:lvl>
     <w:lvl w:ilvl="2">
       <w:start w:val="1"/>
@@ -2874,6 +2492,7 @@
         </w:tabs>
         <w:ind w:start="1440" w:hanging="360"/>
       </w:pPr>
+      <w:rPr/>
     </w:lvl>
     <w:lvl w:ilvl="3">
       <w:start w:val="1"/>
@@ -2886,6 +2505,7 @@
         </w:tabs>
         <w:ind w:start="1800" w:hanging="360"/>
       </w:pPr>
+      <w:rPr/>
     </w:lvl>
     <w:lvl w:ilvl="4">
       <w:start w:val="1"/>
@@ -2898,6 +2518,7 @@
         </w:tabs>
         <w:ind w:start="2160" w:hanging="360"/>
       </w:pPr>
+      <w:rPr/>
     </w:lvl>
     <w:lvl w:ilvl="5">
       <w:start w:val="1"/>
@@ -2910,6 +2531,7 @@
         </w:tabs>
         <w:ind w:start="2520" w:hanging="360"/>
       </w:pPr>
+      <w:rPr/>
     </w:lvl>
     <w:lvl w:ilvl="6">
       <w:start w:val="1"/>
@@ -2922,6 +2544,7 @@
         </w:tabs>
         <w:ind w:start="2880" w:hanging="360"/>
       </w:pPr>
+      <w:rPr/>
     </w:lvl>
     <w:lvl w:ilvl="7">
       <w:start w:val="1"/>
@@ -2934,6 +2557,7 @@
         </w:tabs>
         <w:ind w:start="3240" w:hanging="360"/>
       </w:pPr>
+      <w:rPr/>
     </w:lvl>
     <w:lvl w:ilvl="8">
       <w:start w:val="1"/>
@@ -2946,6 +2570,7 @@
         </w:tabs>
         <w:ind w:start="3600" w:hanging="360"/>
       </w:pPr>
+      <w:rPr/>
     </w:lvl>
   </w:abstractNum>
   <w:abstractNum w:abstractNumId="6">
@@ -2973,6 +2598,7 @@
         </w:tabs>
         <w:ind w:start="1080" w:hanging="360"/>
       </w:pPr>
+      <w:rPr/>
     </w:lvl>
     <w:lvl w:ilvl="2">
       <w:start w:val="1"/>
@@ -2985,6 +2611,7 @@
         </w:tabs>
         <w:ind w:start="1440" w:hanging="360"/>
       </w:pPr>
+      <w:rPr/>
     </w:lvl>
     <w:lvl w:ilvl="3">
       <w:start w:val="1"/>
@@ -2997,6 +2624,7 @@
         </w:tabs>
         <w:ind w:start="1800" w:hanging="360"/>
       </w:pPr>
+      <w:rPr/>
     </w:lvl>
     <w:lvl w:ilvl="4">
       <w:start w:val="1"/>
@@ -3009,6 +2637,7 @@
         </w:tabs>
         <w:ind w:start="2160" w:hanging="360"/>
       </w:pPr>
+      <w:rPr/>
     </w:lvl>
     <w:lvl w:ilvl="5">
       <w:start w:val="1"/>
@@ -3021,6 +2650,7 @@
         </w:tabs>
         <w:ind w:start="2520" w:hanging="360"/>
       </w:pPr>
+      <w:rPr/>
     </w:lvl>
     <w:lvl w:ilvl="6">
       <w:start w:val="1"/>
@@ -3033,6 +2663,7 @@
         </w:tabs>
         <w:ind w:start="2880" w:hanging="360"/>
       </w:pPr>
+      <w:rPr/>
     </w:lvl>
     <w:lvl w:ilvl="7">
       <w:start w:val="1"/>
@@ -3045,6 +2676,7 @@
         </w:tabs>
         <w:ind w:start="3240" w:hanging="360"/>
       </w:pPr>
+      <w:rPr/>
     </w:lvl>
     <w:lvl w:ilvl="8">
       <w:start w:val="1"/>
@@ -3057,6 +2689,7 @@
         </w:tabs>
         <w:ind w:start="3600" w:hanging="360"/>
       </w:pPr>
+      <w:rPr/>
     </w:lvl>
   </w:abstractNum>
   <w:abstractNum w:abstractNumId="7">
@@ -3207,7 +2840,7 @@
   <w:docDefaults>
     <w:rPrDefault>
       <w:rPr>
-        <w:rFonts w:ascii="Cambria" w:hAnsi="Cambria" w:eastAsia="ＭＳ 明朝" w:cs="" w:asciiTheme="minorHAnsi" w:cstheme="minorBidi" w:eastAsiaTheme="minorEastAsia" w:hAnsiTheme="minorHAnsi"/>
+        <w:rFonts w:ascii="Cambria" w:hAnsi="Cambria" w:eastAsia="" w:cs="" w:asciiTheme="minorHAnsi" w:cstheme="minorBidi" w:eastAsiaTheme="minorEastAsia" w:hAnsiTheme="minorHAnsi"/>
         <w:sz w:val="22"/>
         <w:szCs w:val="22"/>
         <w:lang w:val="en-US" w:eastAsia="en-US" w:bidi="ar-SA"/>
@@ -3364,6 +2997,7 @@
     <w:rsid w:val="00fc693f"/>
     <w:pPr>
       <w:widowControl/>
+      <w:suppressAutoHyphens w:val="true"/>
       <w:bidi w:val="0"/>
       <w:spacing w:lineRule="auto" w:line="271" w:before="0" w:after="120"/>
       <w:jc w:val="start"/>
@@ -3392,7 +3026,7 @@
       <w:outlineLvl w:val="0"/>
     </w:pPr>
     <w:rPr>
-      <w:rFonts w:ascii="Calibri" w:hAnsi="Calibri" w:eastAsia="ＭＳ ゴシック" w:cs="" w:asciiTheme="majorHAnsi" w:cstheme="majorBidi" w:eastAsiaTheme="majorEastAsia" w:hAnsiTheme="majorHAnsi"/>
+      <w:rFonts w:ascii="Calibri" w:hAnsi="Calibri" w:eastAsia="" w:cs="" w:asciiTheme="majorHAnsi" w:cstheme="majorBidi" w:eastAsiaTheme="majorEastAsia" w:hAnsiTheme="majorHAnsi"/>
       <w:b/>
       <w:bCs/>
       <w:color w:themeColor="accent1" w:themeShade="bf" w:val="365F91"/>
@@ -3416,7 +3050,7 @@
       <w:outlineLvl w:val="1"/>
     </w:pPr>
     <w:rPr>
-      <w:rFonts w:ascii="Calibri" w:hAnsi="Calibri" w:eastAsia="ＭＳ ゴシック" w:cs="" w:asciiTheme="majorHAnsi" w:cstheme="majorBidi" w:eastAsiaTheme="majorEastAsia" w:hAnsiTheme="majorHAnsi"/>
+      <w:rFonts w:ascii="Calibri" w:hAnsi="Calibri" w:eastAsia="" w:cs="" w:asciiTheme="majorHAnsi" w:cstheme="majorBidi" w:eastAsiaTheme="majorEastAsia" w:hAnsiTheme="majorHAnsi"/>
       <w:b/>
       <w:bCs/>
       <w:color w:themeColor="accent1" w:val="4F81BD"/>
@@ -3440,7 +3074,7 @@
       <w:outlineLvl w:val="2"/>
     </w:pPr>
     <w:rPr>
-      <w:rFonts w:ascii="Calibri" w:hAnsi="Calibri" w:eastAsia="ＭＳ ゴシック" w:cs="" w:asciiTheme="majorHAnsi" w:cstheme="majorBidi" w:eastAsiaTheme="majorEastAsia" w:hAnsiTheme="majorHAnsi"/>
+      <w:rFonts w:ascii="Calibri" w:hAnsi="Calibri" w:eastAsia="" w:cs="" w:asciiTheme="majorHAnsi" w:cstheme="majorBidi" w:eastAsiaTheme="majorEastAsia" w:hAnsiTheme="majorHAnsi"/>
       <w:b/>
       <w:bCs/>
       <w:color w:themeColor="accent1" w:val="4F81BD"/>
@@ -3463,7 +3097,7 @@
       <w:outlineLvl w:val="3"/>
     </w:pPr>
     <w:rPr>
-      <w:rFonts w:ascii="Calibri" w:hAnsi="Calibri" w:eastAsia="ＭＳ ゴシック" w:cs="" w:asciiTheme="majorHAnsi" w:cstheme="majorBidi" w:eastAsiaTheme="majorEastAsia" w:hAnsiTheme="majorHAnsi"/>
+      <w:rFonts w:ascii="Calibri" w:hAnsi="Calibri" w:eastAsia="" w:cs="" w:asciiTheme="majorHAnsi" w:cstheme="majorBidi" w:eastAsiaTheme="majorEastAsia" w:hAnsiTheme="majorHAnsi"/>
       <w:b/>
       <w:bCs/>
       <w:i/>
@@ -3488,7 +3122,7 @@
       <w:outlineLvl w:val="4"/>
     </w:pPr>
     <w:rPr>
-      <w:rFonts w:ascii="Calibri" w:hAnsi="Calibri" w:eastAsia="ＭＳ ゴシック" w:cs="" w:asciiTheme="majorHAnsi" w:cstheme="majorBidi" w:eastAsiaTheme="majorEastAsia" w:hAnsiTheme="majorHAnsi"/>
+      <w:rFonts w:ascii="Calibri" w:hAnsi="Calibri" w:eastAsia="" w:cs="" w:asciiTheme="majorHAnsi" w:cstheme="majorBidi" w:eastAsiaTheme="majorEastAsia" w:hAnsiTheme="majorHAnsi"/>
       <w:color w:themeColor="accent1" w:themeShade="7f" w:val="243F60"/>
     </w:rPr>
   </w:style>
@@ -3509,7 +3143,7 @@
       <w:outlineLvl w:val="5"/>
     </w:pPr>
     <w:rPr>
-      <w:rFonts w:ascii="Calibri" w:hAnsi="Calibri" w:eastAsia="ＭＳ ゴシック" w:cs="" w:asciiTheme="majorHAnsi" w:cstheme="majorBidi" w:eastAsiaTheme="majorEastAsia" w:hAnsiTheme="majorHAnsi"/>
+      <w:rFonts w:ascii="Calibri" w:hAnsi="Calibri" w:eastAsia="" w:cs="" w:asciiTheme="majorHAnsi" w:cstheme="majorBidi" w:eastAsiaTheme="majorEastAsia" w:hAnsiTheme="majorHAnsi"/>
       <w:i/>
       <w:iCs/>
       <w:color w:themeColor="accent1" w:themeShade="7f" w:val="243F60"/>
@@ -3532,7 +3166,7 @@
       <w:outlineLvl w:val="6"/>
     </w:pPr>
     <w:rPr>
-      <w:rFonts w:ascii="Calibri" w:hAnsi="Calibri" w:eastAsia="ＭＳ ゴシック" w:cs="" w:asciiTheme="majorHAnsi" w:cstheme="majorBidi" w:eastAsiaTheme="majorEastAsia" w:hAnsiTheme="majorHAnsi"/>
+      <w:rFonts w:ascii="Calibri" w:hAnsi="Calibri" w:eastAsia="" w:cs="" w:asciiTheme="majorHAnsi" w:cstheme="majorBidi" w:eastAsiaTheme="majorEastAsia" w:hAnsiTheme="majorHAnsi"/>
       <w:i/>
       <w:iCs/>
       <w:color w:themeColor="text1" w:themeTint="bf" w:val="404040"/>
@@ -3555,7 +3189,7 @@
       <w:outlineLvl w:val="7"/>
     </w:pPr>
     <w:rPr>
-      <w:rFonts w:ascii="Calibri" w:hAnsi="Calibri" w:eastAsia="ＭＳ ゴシック" w:cs="" w:asciiTheme="majorHAnsi" w:cstheme="majorBidi" w:eastAsiaTheme="majorEastAsia" w:hAnsiTheme="majorHAnsi"/>
+      <w:rFonts w:ascii="Calibri" w:hAnsi="Calibri" w:eastAsia="" w:cs="" w:asciiTheme="majorHAnsi" w:cstheme="majorBidi" w:eastAsiaTheme="majorEastAsia" w:hAnsiTheme="majorHAnsi"/>
       <w:color w:themeColor="accent1" w:val="4F81BD"/>
       <w:sz w:val="20"/>
       <w:szCs w:val="20"/>
@@ -3578,7 +3212,7 @@
       <w:outlineLvl w:val="8"/>
     </w:pPr>
     <w:rPr>
-      <w:rFonts w:ascii="Calibri" w:hAnsi="Calibri" w:eastAsia="ＭＳ ゴシック" w:cs="" w:asciiTheme="majorHAnsi" w:cstheme="majorBidi" w:eastAsiaTheme="majorEastAsia" w:hAnsiTheme="majorHAnsi"/>
+      <w:rFonts w:ascii="Calibri" w:hAnsi="Calibri" w:eastAsia="" w:cs="" w:asciiTheme="majorHAnsi" w:cstheme="majorBidi" w:eastAsiaTheme="majorEastAsia" w:hAnsiTheme="majorHAnsi"/>
       <w:i/>
       <w:iCs/>
       <w:color w:themeColor="text1" w:themeTint="bf" w:val="404040"/>
@@ -3620,7 +3254,7 @@
     <w:qFormat/>
     <w:rsid w:val="00fc693f"/>
     <w:rPr>
-      <w:rFonts w:ascii="Calibri" w:hAnsi="Calibri" w:eastAsia="ＭＳ ゴシック" w:cs="" w:asciiTheme="majorHAnsi" w:cstheme="majorBidi" w:eastAsiaTheme="majorEastAsia" w:hAnsiTheme="majorHAnsi"/>
+      <w:rFonts w:ascii="Calibri" w:hAnsi="Calibri" w:eastAsia="" w:cs="" w:asciiTheme="majorHAnsi" w:cstheme="majorBidi" w:eastAsiaTheme="majorEastAsia" w:hAnsiTheme="majorHAnsi"/>
       <w:b/>
       <w:bCs/>
       <w:color w:themeColor="accent1" w:themeShade="bf" w:val="365F91"/>
@@ -3636,7 +3270,7 @@
     <w:qFormat/>
     <w:rsid w:val="00fc693f"/>
     <w:rPr>
-      <w:rFonts w:ascii="Calibri" w:hAnsi="Calibri" w:eastAsia="ＭＳ ゴシック" w:cs="" w:asciiTheme="majorHAnsi" w:cstheme="majorBidi" w:eastAsiaTheme="majorEastAsia" w:hAnsiTheme="majorHAnsi"/>
+      <w:rFonts w:ascii="Calibri" w:hAnsi="Calibri" w:eastAsia="" w:cs="" w:asciiTheme="majorHAnsi" w:cstheme="majorBidi" w:eastAsiaTheme="majorEastAsia" w:hAnsiTheme="majorHAnsi"/>
       <w:b/>
       <w:bCs/>
       <w:color w:themeColor="accent1" w:val="4F81BD"/>
@@ -3652,7 +3286,7 @@
     <w:qFormat/>
     <w:rsid w:val="00fc693f"/>
     <w:rPr>
-      <w:rFonts w:ascii="Calibri" w:hAnsi="Calibri" w:eastAsia="ＭＳ ゴシック" w:cs="" w:asciiTheme="majorHAnsi" w:cstheme="majorBidi" w:eastAsiaTheme="majorEastAsia" w:hAnsiTheme="majorHAnsi"/>
+      <w:rFonts w:ascii="Calibri" w:hAnsi="Calibri" w:eastAsia="" w:cs="" w:asciiTheme="majorHAnsi" w:cstheme="majorBidi" w:eastAsiaTheme="majorEastAsia" w:hAnsiTheme="majorHAnsi"/>
       <w:b/>
       <w:bCs/>
       <w:color w:themeColor="accent1" w:val="4F81BD"/>
@@ -3666,7 +3300,7 @@
     <w:qFormat/>
     <w:rsid w:val="00fc693f"/>
     <w:rPr>
-      <w:rFonts w:ascii="Calibri" w:hAnsi="Calibri" w:eastAsia="ＭＳ ゴシック" w:cs="" w:asciiTheme="majorHAnsi" w:cstheme="majorBidi" w:eastAsiaTheme="majorEastAsia" w:hAnsiTheme="majorHAnsi"/>
+      <w:rFonts w:ascii="Calibri" w:hAnsi="Calibri" w:eastAsia="" w:cs="" w:asciiTheme="majorHAnsi" w:cstheme="majorBidi" w:eastAsiaTheme="majorEastAsia" w:hAnsiTheme="majorHAnsi"/>
       <w:color w:themeColor="text2" w:themeShade="bf" w:val="17365D"/>
       <w:spacing w:val="5"/>
       <w:kern w:val="2"/>
@@ -3682,7 +3316,7 @@
     <w:qFormat/>
     <w:rsid w:val="00fc693f"/>
     <w:rPr>
-      <w:rFonts w:ascii="Calibri" w:hAnsi="Calibri" w:eastAsia="ＭＳ ゴシック" w:cs="" w:asciiTheme="majorHAnsi" w:cstheme="majorBidi" w:eastAsiaTheme="majorEastAsia" w:hAnsiTheme="majorHAnsi"/>
+      <w:rFonts w:ascii="Calibri" w:hAnsi="Calibri" w:eastAsia="" w:cs="" w:asciiTheme="majorHAnsi" w:cstheme="majorBidi" w:eastAsiaTheme="majorEastAsia" w:hAnsiTheme="majorHAnsi"/>
       <w:i/>
       <w:iCs/>
       <w:color w:themeColor="accent1" w:val="4F81BD"/>
@@ -3755,7 +3389,7 @@
     <w:qFormat/>
     <w:rsid w:val="00fc693f"/>
     <w:rPr>
-      <w:rFonts w:ascii="Calibri" w:hAnsi="Calibri" w:eastAsia="ＭＳ ゴシック" w:cs="" w:asciiTheme="majorHAnsi" w:cstheme="majorBidi" w:eastAsiaTheme="majorEastAsia" w:hAnsiTheme="majorHAnsi"/>
+      <w:rFonts w:ascii="Calibri" w:hAnsi="Calibri" w:eastAsia="" w:cs="" w:asciiTheme="majorHAnsi" w:cstheme="majorBidi" w:eastAsiaTheme="majorEastAsia" w:hAnsiTheme="majorHAnsi"/>
       <w:b/>
       <w:bCs/>
       <w:i/>
@@ -3772,7 +3406,7 @@
     <w:qFormat/>
     <w:rsid w:val="00fc693f"/>
     <w:rPr>
-      <w:rFonts w:ascii="Calibri" w:hAnsi="Calibri" w:eastAsia="ＭＳ ゴシック" w:cs="" w:asciiTheme="majorHAnsi" w:cstheme="majorBidi" w:eastAsiaTheme="majorEastAsia" w:hAnsiTheme="majorHAnsi"/>
+      <w:rFonts w:ascii="Calibri" w:hAnsi="Calibri" w:eastAsia="" w:cs="" w:asciiTheme="majorHAnsi" w:cstheme="majorBidi" w:eastAsiaTheme="majorEastAsia" w:hAnsiTheme="majorHAnsi"/>
       <w:color w:themeColor="accent1" w:themeShade="7f" w:val="243F60"/>
     </w:rPr>
   </w:style>
@@ -3785,7 +3419,7 @@
     <w:qFormat/>
     <w:rsid w:val="00fc693f"/>
     <w:rPr>
-      <w:rFonts w:ascii="Calibri" w:hAnsi="Calibri" w:eastAsia="ＭＳ ゴシック" w:cs="" w:asciiTheme="majorHAnsi" w:cstheme="majorBidi" w:eastAsiaTheme="majorEastAsia" w:hAnsiTheme="majorHAnsi"/>
+      <w:rFonts w:ascii="Calibri" w:hAnsi="Calibri" w:eastAsia="" w:cs="" w:asciiTheme="majorHAnsi" w:cstheme="majorBidi" w:eastAsiaTheme="majorEastAsia" w:hAnsiTheme="majorHAnsi"/>
       <w:i/>
       <w:iCs/>
       <w:color w:themeColor="accent1" w:themeShade="7f" w:val="243F60"/>
@@ -3800,7 +3434,7 @@
     <w:qFormat/>
     <w:rsid w:val="00fc693f"/>
     <w:rPr>
-      <w:rFonts w:ascii="Calibri" w:hAnsi="Calibri" w:eastAsia="ＭＳ ゴシック" w:cs="" w:asciiTheme="majorHAnsi" w:cstheme="majorBidi" w:eastAsiaTheme="majorEastAsia" w:hAnsiTheme="majorHAnsi"/>
+      <w:rFonts w:ascii="Calibri" w:hAnsi="Calibri" w:eastAsia="" w:cs="" w:asciiTheme="majorHAnsi" w:cstheme="majorBidi" w:eastAsiaTheme="majorEastAsia" w:hAnsiTheme="majorHAnsi"/>
       <w:i/>
       <w:iCs/>
       <w:color w:themeColor="text1" w:themeTint="bf" w:val="404040"/>
@@ -3815,7 +3449,7 @@
     <w:qFormat/>
     <w:rsid w:val="00fc693f"/>
     <w:rPr>
-      <w:rFonts w:ascii="Calibri" w:hAnsi="Calibri" w:eastAsia="ＭＳ ゴシック" w:cs="" w:asciiTheme="majorHAnsi" w:cstheme="majorBidi" w:eastAsiaTheme="majorEastAsia" w:hAnsiTheme="majorHAnsi"/>
+      <w:rFonts w:ascii="Calibri" w:hAnsi="Calibri" w:eastAsia="" w:cs="" w:asciiTheme="majorHAnsi" w:cstheme="majorBidi" w:eastAsiaTheme="majorEastAsia" w:hAnsiTheme="majorHAnsi"/>
       <w:color w:themeColor="accent1" w:val="4F81BD"/>
       <w:sz w:val="20"/>
       <w:szCs w:val="20"/>
@@ -3830,7 +3464,7 @@
     <w:qFormat/>
     <w:rsid w:val="00fc693f"/>
     <w:rPr>
-      <w:rFonts w:ascii="Calibri" w:hAnsi="Calibri" w:eastAsia="ＭＳ ゴシック" w:cs="" w:asciiTheme="majorHAnsi" w:cstheme="majorBidi" w:eastAsiaTheme="majorEastAsia" w:hAnsiTheme="majorHAnsi"/>
+      <w:rFonts w:ascii="Calibri" w:hAnsi="Calibri" w:eastAsia="" w:cs="" w:asciiTheme="majorHAnsi" w:cstheme="majorBidi" w:eastAsiaTheme="majorEastAsia" w:hAnsiTheme="majorHAnsi"/>
       <w:i/>
       <w:iCs/>
       <w:color w:themeColor="text1" w:themeTint="bf" w:val="404040"/>
@@ -4060,12 +3694,13 @@
     <w:rsid w:val="00fc693f"/>
     <w:pPr>
       <w:widowControl/>
+      <w:suppressAutoHyphens w:val="true"/>
       <w:bidi w:val="0"/>
       <w:spacing w:lineRule="auto" w:line="240" w:before="0" w:after="0"/>
       <w:jc w:val="start"/>
     </w:pPr>
     <w:rPr>
-      <w:rFonts w:ascii="Cambria" w:hAnsi="Cambria" w:eastAsia="ＭＳ 明朝" w:cs="" w:asciiTheme="minorHAnsi" w:cstheme="minorBidi" w:eastAsiaTheme="minorEastAsia" w:hAnsiTheme="minorHAnsi"/>
+      <w:rFonts w:ascii="Cambria" w:hAnsi="Cambria" w:eastAsia="" w:cs="" w:asciiTheme="minorHAnsi" w:cstheme="minorBidi" w:eastAsiaTheme="minorEastAsia" w:hAnsiTheme="minorHAnsi"/>
       <w:color w:val="auto"/>
       <w:kern w:val="0"/>
       <w:sz w:val="22"/>
@@ -4089,7 +3724,7 @@
       <w:contextualSpacing/>
     </w:pPr>
     <w:rPr>
-      <w:rFonts w:ascii="Calibri" w:hAnsi="Calibri" w:eastAsia="ＭＳ ゴシック" w:cs="" w:asciiTheme="majorHAnsi" w:cstheme="majorBidi" w:eastAsiaTheme="majorEastAsia" w:hAnsiTheme="majorHAnsi"/>
+      <w:rFonts w:ascii="Calibri" w:hAnsi="Calibri" w:eastAsia="" w:cs="" w:asciiTheme="majorHAnsi" w:cstheme="majorBidi" w:eastAsiaTheme="majorEastAsia" w:hAnsiTheme="majorHAnsi"/>
       <w:color w:themeColor="text2" w:themeShade="bf" w:val="17365D"/>
       <w:spacing w:val="5"/>
       <w:kern w:val="2"/>
@@ -4107,7 +3742,7 @@
     <w:rsid w:val="00fc693f"/>
     <w:pPr/>
     <w:rPr>
-      <w:rFonts w:ascii="Calibri" w:hAnsi="Calibri" w:eastAsia="ＭＳ ゴシック" w:cs="" w:asciiTheme="majorHAnsi" w:cstheme="majorBidi" w:eastAsiaTheme="majorEastAsia" w:hAnsiTheme="majorHAnsi"/>
+      <w:rFonts w:ascii="Calibri" w:hAnsi="Calibri" w:eastAsia="" w:cs="" w:asciiTheme="majorHAnsi" w:cstheme="majorBidi" w:eastAsiaTheme="majorEastAsia" w:hAnsiTheme="majorHAnsi"/>
       <w:i/>
       <w:iCs/>
       <w:color w:themeColor="accent1" w:val="4F81BD"/>
@@ -4340,12 +3975,13 @@
         <w:tab w:val="left" w:pos="3456" w:leader="none"/>
         <w:tab w:val="left" w:pos="4032" w:leader="none"/>
       </w:tabs>
+      <w:suppressAutoHyphens w:val="true"/>
       <w:bidi w:val="0"/>
       <w:spacing w:lineRule="auto" w:line="276" w:before="0" w:after="200"/>
       <w:jc w:val="start"/>
     </w:pPr>
     <w:rPr>
-      <w:rFonts w:ascii="Courier" w:hAnsi="Courier" w:eastAsia="ＭＳ 明朝" w:cs="" w:cstheme="minorBidi" w:eastAsiaTheme="minorEastAsia"/>
+      <w:rFonts w:ascii="Courier" w:hAnsi="Courier" w:eastAsia="" w:cs="" w:cstheme="minorBidi" w:eastAsiaTheme="minorEastAsia"/>
       <w:color w:val="auto"/>
       <w:kern w:val="0"/>
       <w:sz w:val="20"/>
@@ -4416,6 +4052,7 @@
     <w:qFormat/>
     <w:pPr>
       <w:widowControl/>
+      <w:suppressAutoHyphens w:val="true"/>
       <w:bidi w:val="0"/>
       <w:spacing w:lineRule="auto" w:line="269" w:before="0" w:after="60"/>
       <w:jc w:val="start"/>
@@ -4435,6 +4072,7 @@
     <w:qFormat/>
     <w:pPr>
       <w:widowControl/>
+      <w:suppressAutoHyphens w:val="true"/>
       <w:bidi w:val="0"/>
       <w:spacing w:lineRule="auto" w:line="269" w:before="0" w:after="240"/>
       <w:jc w:val="start"/>
@@ -4454,6 +4092,7 @@
     <w:qFormat/>
     <w:pPr>
       <w:widowControl/>
+      <w:suppressAutoHyphens w:val="true"/>
       <w:bidi w:val="0"/>
       <w:spacing w:lineRule="auto" w:line="269" w:before="0" w:after="100"/>
       <w:jc w:val="start"/>
@@ -4473,6 +4112,7 @@
     <w:qFormat/>
     <w:pPr>
       <w:widowControl/>
+      <w:suppressAutoHyphens w:val="true"/>
       <w:bidi w:val="0"/>
       <w:spacing w:lineRule="auto" w:line="269" w:before="0" w:after="60"/>
       <w:jc w:val="start"/>
@@ -4492,6 +4132,7 @@
     <w:qFormat/>
     <w:pPr>
       <w:widowControl/>
+      <w:suppressAutoHyphens w:val="true"/>
       <w:bidi w:val="0"/>
       <w:spacing w:lineRule="auto" w:line="269" w:before="0" w:after="80"/>
       <w:jc w:val="start"/>
@@ -4511,6 +4152,7 @@
     <w:qFormat/>
     <w:pPr>
       <w:widowControl/>
+      <w:suppressAutoHyphens w:val="true"/>
       <w:bidi w:val="0"/>
       <w:spacing w:lineRule="auto" w:line="269" w:before="0" w:after="40"/>
       <w:jc w:val="start"/>
@@ -7680,7 +7322,6 @@
       <w:pPr>
         <w:spacing w:before="0" w:after="0" w:line="240" w:lineRule="auto"/>
       </w:pPr>
-      <w:rPr/>
       <w:tblPr/>
       <w:tcPr>
         <w:tcBorders>
@@ -7826,7 +7467,6 @@
       <w:pPr>
         <w:spacing w:before="0" w:after="0" w:line="240" w:lineRule="auto"/>
       </w:pPr>
-      <w:rPr/>
       <w:tblPr/>
       <w:tcPr>
         <w:tcBorders>
@@ -7972,7 +7612,6 @@
       <w:pPr>
         <w:spacing w:before="0" w:after="0" w:line="240" w:lineRule="auto"/>
       </w:pPr>
-      <w:rPr/>
       <w:tblPr/>
       <w:tcPr>
         <w:tcBorders>
@@ -8118,7 +7757,6 @@
       <w:pPr>
         <w:spacing w:before="0" w:after="0" w:line="240" w:lineRule="auto"/>
       </w:pPr>
-      <w:rPr/>
       <w:tblPr/>
       <w:tcPr>
         <w:tcBorders>
@@ -8264,7 +7902,6 @@
       <w:pPr>
         <w:spacing w:before="0" w:after="0" w:line="240" w:lineRule="auto"/>
       </w:pPr>
-      <w:rPr/>
       <w:tblPr/>
       <w:tcPr>
         <w:tcBorders>
@@ -8410,7 +8047,6 @@
       <w:pPr>
         <w:spacing w:before="0" w:after="0" w:line="240" w:lineRule="auto"/>
       </w:pPr>
-      <w:rPr/>
       <w:tblPr/>
       <w:tcPr>
         <w:tcBorders>
@@ -8556,7 +8192,6 @@
       <w:pPr>
         <w:spacing w:before="0" w:after="0" w:line="240" w:lineRule="auto"/>
       </w:pPr>
-      <w:rPr/>
       <w:tblPr/>
       <w:tcPr>
         <w:tcBorders>

</xml_diff>

<commit_message>
Updated structure to include final video lines
</commit_message>
<xml_diff>
--- a/DRAFT_PULSAR_Berbec.docx
+++ b/DRAFT_PULSAR_Berbec.docx
@@ -160,8 +160,8 @@
         <w:tblLook w:val="04a0" w:noHBand="0" w:noVBand="1" w:firstColumn="1" w:lastRow="0" w:lastColumn="0" w:firstRow="1"/>
       </w:tblPr>
       <w:tblGrid>
-        <w:gridCol w:w="1529"/>
-        <w:gridCol w:w="8221"/>
+        <w:gridCol w:w="1527"/>
+        <w:gridCol w:w="8223"/>
       </w:tblGrid>
       <w:tr>
         <w:trPr>
@@ -169,7 +169,7 @@
         </w:trPr>
         <w:tc>
           <w:tcPr>
-            <w:tcW w:w="1529" w:type="dxa"/>
+            <w:tcW w:w="1527" w:type="dxa"/>
             <w:tcBorders/>
           </w:tcPr>
           <w:p>
@@ -207,7 +207,7 @@
         </w:tc>
         <w:tc>
           <w:tcPr>
-            <w:tcW w:w="8221" w:type="dxa"/>
+            <w:tcW w:w="8223" w:type="dxa"/>
             <w:tcBorders/>
           </w:tcPr>
           <w:p>
@@ -296,8 +296,8 @@
         <w:tblLook w:val="04a0" w:noHBand="0" w:noVBand="1" w:firstColumn="1" w:lastRow="0" w:lastColumn="0" w:firstRow="1"/>
       </w:tblPr>
       <w:tblGrid>
-        <w:gridCol w:w="1529"/>
-        <w:gridCol w:w="8221"/>
+        <w:gridCol w:w="1527"/>
+        <w:gridCol w:w="8223"/>
       </w:tblGrid>
       <w:tr>
         <w:trPr>
@@ -305,7 +305,7 @@
         </w:trPr>
         <w:tc>
           <w:tcPr>
-            <w:tcW w:w="1529" w:type="dxa"/>
+            <w:tcW w:w="1527" w:type="dxa"/>
             <w:tcBorders/>
           </w:tcPr>
           <w:p>
@@ -343,7 +343,7 @@
         </w:tc>
         <w:tc>
           <w:tcPr>
-            <w:tcW w:w="8221" w:type="dxa"/>
+            <w:tcW w:w="8223" w:type="dxa"/>
             <w:tcBorders/>
           </w:tcPr>
           <w:p>
@@ -457,8 +457,8 @@
         <w:tblLook w:val="04a0" w:noHBand="0" w:noVBand="1" w:firstColumn="1" w:lastRow="0" w:lastColumn="0" w:firstRow="1"/>
       </w:tblPr>
       <w:tblGrid>
-        <w:gridCol w:w="1529"/>
-        <w:gridCol w:w="8221"/>
+        <w:gridCol w:w="1527"/>
+        <w:gridCol w:w="8223"/>
       </w:tblGrid>
       <w:tr>
         <w:trPr>
@@ -466,7 +466,7 @@
         </w:trPr>
         <w:tc>
           <w:tcPr>
-            <w:tcW w:w="1529" w:type="dxa"/>
+            <w:tcW w:w="1527" w:type="dxa"/>
             <w:tcBorders/>
           </w:tcPr>
           <w:p>
@@ -504,7 +504,7 @@
         </w:tc>
         <w:tc>
           <w:tcPr>
-            <w:tcW w:w="8221" w:type="dxa"/>
+            <w:tcW w:w="8223" w:type="dxa"/>
             <w:tcBorders/>
           </w:tcPr>
           <w:p>
@@ -684,8 +684,8 @@
         <w:tblLook w:val="04a0" w:noHBand="0" w:noVBand="1" w:firstColumn="1" w:lastRow="0" w:lastColumn="0" w:firstRow="1"/>
       </w:tblPr>
       <w:tblGrid>
-        <w:gridCol w:w="1529"/>
-        <w:gridCol w:w="8152"/>
+        <w:gridCol w:w="1527"/>
+        <w:gridCol w:w="8154"/>
       </w:tblGrid>
       <w:tr>
         <w:trPr>
@@ -693,7 +693,7 @@
         </w:trPr>
         <w:tc>
           <w:tcPr>
-            <w:tcW w:w="1529" w:type="dxa"/>
+            <w:tcW w:w="1527" w:type="dxa"/>
             <w:tcBorders/>
           </w:tcPr>
           <w:p>
@@ -731,7 +731,7 @@
         </w:tc>
         <w:tc>
           <w:tcPr>
-            <w:tcW w:w="8152" w:type="dxa"/>
+            <w:tcW w:w="8154" w:type="dxa"/>
             <w:tcBorders/>
           </w:tcPr>
           <w:p>
@@ -845,8 +845,8 @@
         <w:tblLook w:val="04a0" w:noHBand="0" w:noVBand="1" w:firstColumn="1" w:lastRow="0" w:lastColumn="0" w:firstRow="1"/>
       </w:tblPr>
       <w:tblGrid>
-        <w:gridCol w:w="1529"/>
-        <w:gridCol w:w="8221"/>
+        <w:gridCol w:w="1527"/>
+        <w:gridCol w:w="8223"/>
       </w:tblGrid>
       <w:tr>
         <w:trPr>
@@ -854,7 +854,7 @@
         </w:trPr>
         <w:tc>
           <w:tcPr>
-            <w:tcW w:w="1529" w:type="dxa"/>
+            <w:tcW w:w="1527" w:type="dxa"/>
             <w:tcBorders/>
           </w:tcPr>
           <w:p>
@@ -892,7 +892,7 @@
         </w:tc>
         <w:tc>
           <w:tcPr>
-            <w:tcW w:w="8221" w:type="dxa"/>
+            <w:tcW w:w="8223" w:type="dxa"/>
             <w:tcBorders/>
           </w:tcPr>
           <w:p>
@@ -1006,8 +1006,8 @@
         <w:tblLook w:val="04a0" w:noHBand="0" w:noVBand="1" w:firstColumn="1" w:lastRow="0" w:lastColumn="0" w:firstRow="1"/>
       </w:tblPr>
       <w:tblGrid>
-        <w:gridCol w:w="1529"/>
-        <w:gridCol w:w="8221"/>
+        <w:gridCol w:w="1527"/>
+        <w:gridCol w:w="8223"/>
       </w:tblGrid>
       <w:tr>
         <w:trPr>
@@ -1015,7 +1015,7 @@
         </w:trPr>
         <w:tc>
           <w:tcPr>
-            <w:tcW w:w="1529" w:type="dxa"/>
+            <w:tcW w:w="1527" w:type="dxa"/>
             <w:tcBorders/>
           </w:tcPr>
           <w:p>
@@ -1053,7 +1053,7 @@
         </w:tc>
         <w:tc>
           <w:tcPr>
-            <w:tcW w:w="8221" w:type="dxa"/>
+            <w:tcW w:w="8223" w:type="dxa"/>
             <w:tcBorders/>
           </w:tcPr>
           <w:p>
@@ -1069,16 +1069,7 @@
                 <w:color w:val="1D2933"/>
                 <w:sz w:val="26"/>
               </w:rPr>
-              <w:t xml:space="preserve">The </w:t>
-            </w:r>
-            <w:r>
-              <w:rPr>
-                <w:rFonts w:eastAsia="Lato"/>
-                <w:b/>
-                <w:color w:val="1D2933"/>
-                <w:sz w:val="26"/>
-              </w:rPr>
-              <w:t>future</w:t>
+              <w:t>The future</w:t>
             </w:r>
           </w:p>
           <w:p>
@@ -1093,15 +1084,7 @@
                 <w:color w:val="1D2933"/>
                 <w:sz w:val="18"/>
               </w:rPr>
-              <w:t xml:space="preserve">Revenim în cadru lângă Berbec pe Campus pentru efectul dramatic. </w:t>
-            </w:r>
-            <w:r>
-              <w:rPr>
-                <w:rFonts w:eastAsia="Lato"/>
-                <w:color w:val="1D2933"/>
-                <w:sz w:val="18"/>
-              </w:rPr>
-              <w:t>Explicăm cum deși această versiune de rover este cea mai bună de până acum, nu ne vom oprim aici.</w:t>
+              <w:t>Revenim în cadru lângă Berbec pe Campus pentru efectul dramatic. Explicăm cum deși această versiune de rover este cea mai bună de până acum, nu ne vom oprim aici.</w:t>
             </w:r>
           </w:p>
           <w:p>
@@ -1167,15 +1150,7 @@
                 <w:color w:val="5E6C77"/>
                 <w:sz w:val="18"/>
               </w:rPr>
-              <w:t xml:space="preserve">Schimbare de ritm în muzică. </w:t>
-            </w:r>
-            <w:r>
-              <w:rPr>
-                <w:rFonts w:eastAsia="Lato"/>
-                <w:color w:val="5E6C77"/>
-                <w:sz w:val="18"/>
-              </w:rPr>
-              <w:t>Scenă cu apus de soare.</w:t>
+              <w:t>Schimbare de ritm în muzică. Scenă cu apus de soare.</w:t>
             </w:r>
           </w:p>
         </w:tc>
@@ -1209,8 +1184,8 @@
         <w:tblLook w:val="04a0" w:noHBand="0" w:noVBand="1" w:firstColumn="1" w:lastRow="0" w:lastColumn="0" w:firstRow="1"/>
       </w:tblPr>
       <w:tblGrid>
-        <w:gridCol w:w="1529"/>
-        <w:gridCol w:w="8221"/>
+        <w:gridCol w:w="1527"/>
+        <w:gridCol w:w="8223"/>
       </w:tblGrid>
       <w:tr>
         <w:trPr>
@@ -1218,7 +1193,7 @@
         </w:trPr>
         <w:tc>
           <w:tcPr>
-            <w:tcW w:w="1529" w:type="dxa"/>
+            <w:tcW w:w="1527" w:type="dxa"/>
             <w:tcBorders/>
           </w:tcPr>
           <w:p>
@@ -1256,7 +1231,7 @@
         </w:tc>
         <w:tc>
           <w:tcPr>
-            <w:tcW w:w="8221" w:type="dxa"/>
+            <w:tcW w:w="8223" w:type="dxa"/>
             <w:tcBorders/>
           </w:tcPr>
           <w:p>
@@ -1792,6 +1767,339 @@
       <w:r>
         <w:rPr/>
       </w:r>
+      <w:r>
+        <w:br w:type="page"/>
+      </w:r>
+    </w:p>
+    <w:p>
+      <w:pPr>
+        <w:pStyle w:val="CaptionSmall"/>
+        <w:spacing w:before="0" w:after="120"/>
+        <w:rPr/>
+      </w:pPr>
+      <w:r>
+        <w:rPr>
+          <w:rFonts w:eastAsia="Lato"/>
+          <w:b/>
+          <w:color w:val="BC492A"/>
+          <w:sz w:val="18"/>
+        </w:rPr>
+        <w:t>REPLICI / SCRIPT VIDEO</w:t>
+      </w:r>
+    </w:p>
+    <w:p>
+      <w:pPr>
+        <w:pStyle w:val="SectionHeading"/>
+        <w:spacing w:before="0" w:after="240"/>
+        <w:rPr/>
+      </w:pPr>
+      <w:r>
+        <w:rPr>
+          <w:rFonts w:eastAsia="Lato"/>
+          <w:b/>
+          <w:color w:val="1D2933"/>
+          <w:sz w:val="38"/>
+        </w:rPr>
+        <w:t>Replici</w:t>
+      </w:r>
+    </w:p>
+    <w:p>
+      <w:pPr>
+        <w:pStyle w:val="MiniHead"/>
+        <w:spacing w:before="160" w:after="100"/>
+        <w:rPr/>
+      </w:pPr>
+      <w:r>
+        <w:rPr/>
+        <w:t>02  ·  This is Berbec</w:t>
+      </w:r>
+    </w:p>
+    <w:p>
+      <w:pPr>
+        <w:pStyle w:val="BodySmall"/>
+        <w:spacing w:before="0" w:after="200"/>
+        <w:rPr/>
+      </w:pPr>
+      <w:r>
+        <w:rPr/>
+        <w:t>“</w:t>
+      </w:r>
+      <w:r>
+        <w:rPr/>
+        <w:t>This is Berbec, PULSAR’s current rover. What you’re looking at is version 1.6. But it didn’t start here. Our first working version was 1.5. While it proved the concept, it was far from perfect and it could be improved. And, that’s exactly what we did.”</w:t>
+      </w:r>
+    </w:p>
+    <w:p>
+      <w:pPr>
+        <w:pStyle w:val="MiniHead"/>
+        <w:spacing w:before="160" w:after="100"/>
+        <w:rPr/>
+      </w:pPr>
+      <w:r>
+        <w:rPr/>
+        <w:t>03  ·  From v1.5 to v1.6</w:t>
+      </w:r>
+    </w:p>
+    <w:p>
+      <w:pPr>
+        <w:pStyle w:val="BodySmall"/>
+        <w:spacing w:before="0" w:after="200"/>
+        <w:rPr/>
+      </w:pPr>
+      <w:r>
+        <w:rPr/>
+        <w:t>“</w:t>
+      </w:r>
+      <w:r>
+        <w:rPr/>
+        <w:t>Version 1.5 gave us a working platform to build off from. Version 1.6 came from figuring out what needed to change.”</w:t>
+      </w:r>
+    </w:p>
+    <w:p>
+      <w:pPr>
+        <w:pStyle w:val="BodySmall"/>
+        <w:spacing w:before="0" w:after="200"/>
+        <w:rPr/>
+      </w:pPr>
+      <w:r>
+        <w:rPr/>
+        <w:t>“</w:t>
+      </w:r>
+      <w:r>
+        <w:rPr/>
+        <w:t>There we’re [3] main problems with v1.5 that we fixed in v1.6”</w:t>
+      </w:r>
+    </w:p>
+    <w:p>
+      <w:pPr>
+        <w:pStyle w:val="BodySmall"/>
+        <w:spacing w:before="0" w:after="200"/>
+        <w:rPr/>
+      </w:pPr>
+      <w:r>
+        <w:rPr/>
+        <w:t>“</w:t>
+      </w:r>
+      <w:r>
+        <w:rPr/>
+        <w:t>The first one is the steering system. [etc]”</w:t>
+      </w:r>
+    </w:p>
+    <w:p>
+      <w:pPr>
+        <w:pStyle w:val="BodySmall"/>
+        <w:spacing w:before="0" w:after="200"/>
+        <w:rPr/>
+      </w:pPr>
+      <w:r>
+        <w:rPr/>
+        <w:t>“</w:t>
+      </w:r>
+      <w:r>
+        <w:rPr/>
+        <w:t>The second one is [???].”</w:t>
+        <w:br/>
+        <w:t>“And the final, most important one is [???].”</w:t>
+      </w:r>
+    </w:p>
+    <w:p>
+      <w:pPr>
+        <w:pStyle w:val="MiniHead"/>
+        <w:spacing w:before="160" w:after="100"/>
+        <w:rPr/>
+      </w:pPr>
+      <w:r>
+        <w:rPr/>
+        <w:t>04  ·  Testing Berbec</w:t>
+      </w:r>
+    </w:p>
+    <w:p>
+      <w:pPr>
+        <w:pStyle w:val="BodySmall"/>
+        <w:spacing w:before="0" w:after="200"/>
+        <w:rPr/>
+      </w:pPr>
+      <w:r>
+        <w:rPr/>
+        <w:t>“</w:t>
+      </w:r>
+      <w:r>
+        <w:rPr/>
+        <w:t>However, theory can only get you so far, we had to test its actual capabilities.”</w:t>
+      </w:r>
+    </w:p>
+    <w:p>
+      <w:pPr>
+        <w:pStyle w:val="BodySmall"/>
+        <w:spacing w:before="0" w:after="200"/>
+        <w:rPr/>
+      </w:pPr>
+      <w:r>
+        <w:rPr/>
+        <w:t>“</w:t>
+      </w:r>
+      <w:r>
+        <w:rPr/>
+        <w:t>The first test will be rough terrain, where because of the new bogie system it should handle it much better.”</w:t>
+      </w:r>
+    </w:p>
+    <w:p>
+      <w:pPr>
+        <w:pStyle w:val="BodySmall"/>
+        <w:spacing w:before="0" w:after="200"/>
+        <w:rPr/>
+      </w:pPr>
+      <w:r>
+        <w:rPr/>
+        <w:t>“</w:t>
+      </w:r>
+      <w:r>
+        <w:rPr/>
+        <w:t>Another test is the steering test, how smooth can it turn around? Let’s find out.”</w:t>
+      </w:r>
+    </w:p>
+    <w:p>
+      <w:pPr>
+        <w:pStyle w:val="MiniHead"/>
+        <w:spacing w:before="160" w:after="100"/>
+        <w:rPr/>
+      </w:pPr>
+      <w:r>
+        <w:rPr/>
+        <w:t>05  ·  Under the hood</w:t>
+      </w:r>
+    </w:p>
+    <w:p>
+      <w:pPr>
+        <w:pStyle w:val="BodySmall"/>
+        <w:spacing w:before="0" w:after="200"/>
+        <w:rPr/>
+      </w:pPr>
+      <w:r>
+        <w:rPr/>
+        <w:t>“</w:t>
+      </w:r>
+      <w:r>
+        <w:rPr/>
+        <w:t>A lot of what makes Berbec work isn’t visible from the outside. So, here’s what’s running behind the scenes.”</w:t>
+      </w:r>
+    </w:p>
+    <w:p>
+      <w:pPr>
+        <w:pStyle w:val="BodySmall"/>
+        <w:spacing w:before="0" w:after="200"/>
+        <w:rPr/>
+      </w:pPr>
+      <w:r>
+        <w:rPr/>
+        <w:t>“</w:t>
+      </w:r>
+      <w:r>
+        <w:rPr/>
+        <w:t>The rover is built out of 3 main systems: mechanical, electrical and software.”</w:t>
+      </w:r>
+    </w:p>
+    <w:p>
+      <w:pPr>
+        <w:pStyle w:val="BodySmall"/>
+        <w:spacing w:before="0" w:after="200"/>
+        <w:rPr/>
+      </w:pPr>
+      <w:r>
+        <w:rPr/>
+        <w:t>“</w:t>
+      </w:r>
+      <w:r>
+        <w:rPr/>
+        <w:t>The mechanical part is the visible one, the chasis and bogie system.”</w:t>
+        <w:br/>
+        <w:t>“The electrical part is inside the electrical box, where a Jetson Orin Nano handles all compute.”</w:t>
+        <w:br/>
+        <w:t>“And finally, the software, which is built in-house for a seamless operating and developing experience.”</w:t>
+      </w:r>
+    </w:p>
+    <w:p>
+      <w:pPr>
+        <w:pStyle w:val="MiniHead"/>
+        <w:spacing w:before="160" w:after="100"/>
+        <w:rPr/>
+      </w:pPr>
+      <w:r>
+        <w:rPr/>
+        <w:t>06  ·  The future</w:t>
+      </w:r>
+    </w:p>
+    <w:p>
+      <w:pPr>
+        <w:pStyle w:val="BodySmall"/>
+        <w:spacing w:before="0" w:after="200"/>
+        <w:rPr/>
+      </w:pPr>
+      <w:r>
+        <w:rPr/>
+        <w:t>“</w:t>
+      </w:r>
+      <w:r>
+        <w:rPr/>
+        <w:t>But this isn't where we stop. In fact, far from it. We keep refining and improving the rover and our team continuousely.”</w:t>
+      </w:r>
+    </w:p>
+    <w:p>
+      <w:pPr>
+        <w:pStyle w:val="BodySmall"/>
+        <w:spacing w:before="0" w:after="200"/>
+        <w:rPr/>
+      </w:pPr>
+      <w:r>
+        <w:rPr/>
+        <w:t>“</w:t>
+      </w:r>
+      <w:r>
+        <w:rPr/>
+        <w:t>One of our ideas for a future version is [???].”</w:t>
+      </w:r>
+    </w:p>
+    <w:p>
+      <w:pPr>
+        <w:pStyle w:val="MiniHead"/>
+        <w:spacing w:before="160" w:after="100"/>
+        <w:rPr/>
+      </w:pPr>
+      <w:r>
+        <w:rPr/>
+        <w:t>07  ·  Final</w:t>
+      </w:r>
+    </w:p>
+    <w:p>
+      <w:pPr>
+        <w:pStyle w:val="BodySmall"/>
+        <w:spacing w:before="0" w:after="200"/>
+        <w:rPr/>
+      </w:pPr>
+      <w:r>
+        <w:rPr/>
+        <w:t>“</w:t>
+      </w:r>
+      <w:r>
+        <w:rPr/>
+        <w:t xml:space="preserve">Berbec 1.6 shows how far we've come </w:t>
+      </w:r>
+      <w:r>
+        <w:rPr/>
+        <w:t>as a team, b</w:t>
+      </w:r>
+      <w:r>
+        <w:rPr/>
+        <w:t xml:space="preserve">ut we're already working on what's next, pushing the boundaries of what our rover </w:t>
+      </w:r>
+      <w:r>
+        <w:rPr/>
+        <w:t xml:space="preserve">and team </w:t>
+      </w:r>
+      <w:r>
+        <w:rPr/>
+        <w:t>can achieve.”</w:t>
+      </w:r>
     </w:p>
     <w:sectPr>
       <w:headerReference w:type="even" r:id="rId2"/>
@@ -1856,7 +2164,7 @@
     </w:r>
     <w:r>
       <w:rPr/>
-      <w:t>3</w:t>
+      <w:t>4</w:t>
     </w:r>
     <w:r>
       <w:rPr/>
@@ -1896,7 +2204,7 @@
     </w:r>
     <w:r>
       <w:rPr/>
-      <w:t>3</w:t>
+      <w:t>4</w:t>
     </w:r>
     <w:r>
       <w:rPr/>

</xml_diff>